<commit_message>
Corregir informe semestral PETI 2026
</commit_message>
<xml_diff>
--- a/Informe_Semestral_Seguimiento_PETI_2026.docx
+++ b/Informe_Semestral_Seguimiento_PETI_2026.docx
@@ -69,13 +69,6 @@
       <w:pPr>
         <w:jc w:val="center"/>
       </w:pPr>
-      <w:r>
-        <w:rPr>
-          <w:b/>
-        </w:rPr>
-        <w:t>Dirigido a: Control Interno</w:t>
-        <w:br/>
-      </w:r>
       <w:r>
         <w:t>Elaborado por: Hamilton Quintero García</w:t>
         <w:br/>
@@ -326,52 +319,6 @@
                 <w:color w:val="FFFFFF"/>
                 <w:sz w:val="18"/>
               </w:rPr>
-              <w:t>Destinatario</w:t>
-            </w:r>
-          </w:p>
-        </w:tc>
-        <w:tc>
-          <w:tcPr>
-            <w:tcW w:type="dxa" w:w="4816"/>
-            <w:vAlign w:val="center"/>
-          </w:tcPr>
-          <w:p>
-            <w:pPr>
-              <w:spacing w:after="0"/>
-              <w:jc w:val="left"/>
-            </w:pPr>
-            <w:r/>
-            <w:r>
-              <w:rPr>
-                <w:rFonts w:ascii="Arial" w:hAnsi="Arial"/>
-                <w:b w:val="0"/>
-                <w:sz w:val="18"/>
-              </w:rPr>
-              <w:t>Control Interno</w:t>
-            </w:r>
-          </w:p>
-        </w:tc>
-      </w:tr>
-      <w:tr>
-        <w:tc>
-          <w:tcPr>
-            <w:tcW w:type="dxa" w:w="4816"/>
-            <w:vAlign w:val="center"/>
-            <w:shd w:fill="2F5597"/>
-          </w:tcPr>
-          <w:p>
-            <w:pPr>
-              <w:spacing w:after="0"/>
-              <w:jc w:val="left"/>
-            </w:pPr>
-            <w:r/>
-            <w:r>
-              <w:rPr>
-                <w:rFonts w:ascii="Arial" w:hAnsi="Arial"/>
-                <w:b/>
-                <w:color w:val="FFFFFF"/>
-                <w:sz w:val="18"/>
-              </w:rPr>
               <w:t>Responsable de elaboración</w:t>
             </w:r>
           </w:p>
@@ -415,7 +362,7 @@
         <w:rPr>
           <w:i w:val="0"/>
         </w:rPr>
-        <w:t>La Dirección Administrativa y Financiera de Promueve Más S.A.S. elabora el presente Informe Semestral de Seguimiento al Plan Estratégico de Tecnologías de la Información y las Comunicaciones – PETI 2026, en cumplimiento de la actividad de seguimiento semestral incorporada en el propio plan y como mecanismo de evaluación, control y mejora de la gestión institucional en materia tecnológica.</w:t>
+        <w:t>Promueve Más S.A.S., a través de la Dirección Administrativa y Financiera, presenta el Informe Semestral de Seguimiento al Plan Estratégico de Tecnologías de la Información y las Comunicaciones – PETI 2026. El documento consolida el estado de las actividades programadas entre enero y junio, los productos obtenidos, las situaciones pendientes y las acciones recomendadas para la continuidad del plan.</w:t>
       </w:r>
     </w:p>
     <w:p>
@@ -426,7 +373,7 @@
         <w:rPr>
           <w:i w:val="0"/>
         </w:rPr>
-        <w:t>El seguimiento permite verificar el nivel de ejecución de las actividades programadas, identificar logros, alertas, dependencias y acciones pendientes, así como suministrar a Control Interno información objetiva para el ejercicio de sus funciones de evaluación y seguimiento. El análisis se articula con los principios del Modelo Integrado de Planeación y Gestión – MIPG, la Política de Gobierno Digital y los lineamientos institucionales de seguridad y privacidad de la información.</w:t>
+        <w:t>Durante 2026 la entidad implementó por primera vez un plan de trabajo asociado al PETI y una práctica formal de seguimiento semestral. En 2025 no existían estos dos instrumentos de gestión. Su incorporación representa un avance institucional porque permite organizar actividades, responsables, períodos y evidencias, y facilita la continuidad de la gestión tecnológica.</w:t>
       </w:r>
     </w:p>
     <w:p>
@@ -437,7 +384,7 @@
         <w:rPr>
           <w:i w:val="0"/>
         </w:rPr>
-        <w:t>En el presente informe se revisan los principales frentes del PETI: actualización y planeación estratégica, seguridad de la información, seguimiento a los servicios tecnológicos contratados, fortalecimiento de capacidades en seguridad digital y monitoreo del cumplimiento del plan. El resultado consolidado del primer semestre corresponde a cinco (5) hitos ejecutados de seis (6) programados, para un cumplimiento del 83,33%.</w:t>
+        <w:t>En el primer semestre se programaron seis (6) hitos, de los cuales cinco (5) se encuentran ejecutados y uno (1) pendiente. El resultado semestral es del 83,33%. El hito pendiente corresponde a la capacitación en seguridad digital, sujeta a la confirmación de fecha por parte de MinTIC.</w:t>
       </w:r>
     </w:p>
     <w:p>
@@ -456,7 +403,7 @@
         <w:rPr>
           <w:i w:val="0"/>
         </w:rPr>
-        <w:t>Evaluar el avance y cumplimiento del Plan Estratégico de Tecnologías de la Información y las Comunicaciones – PETI de Promueve Más S.A.S. durante el primer semestre de 2026, documentando los resultados alcanzados, las evidencias disponibles, las situaciones pendientes y las recomendaciones requeridas para fortalecer su ejecución durante el segundo semestre.</w:t>
+        <w:t>Presentar el avance del Plan Estratégico de Tecnologías de la Información y las Comunicaciones – PETI de Promueve Más S.A.S. durante el primer semestre de 2026, dejando constancia de los resultados alcanzados, las evidencias disponibles, las situaciones pendientes y las acciones requeridas para fortalecer su ejecución durante el segundo semestre.</w:t>
       </w:r>
     </w:p>
     <w:p>
@@ -464,7 +411,7 @@
         <w:pStyle w:val="Heading1"/>
       </w:pPr>
       <w:r>
-        <w:t>3. ALCANCE Y PERÍODO EVALUADO</w:t>
+        <w:t>3. ALCANCE Y PERÍODO DEL INFORME</w:t>
       </w:r>
     </w:p>
     <w:p>
@@ -475,179 +422,7 @@
         <w:rPr>
           <w:i w:val="0"/>
         </w:rPr>
-        <w:t>El informe comprende las actividades e hitos del PETI programados entre el 1 de enero y el 30 de junio de 2026. La medición incluye el resultado del presente informe como hito ejecutado del cierre semestral. Las actividades previstas para el segundo semestre se presentan únicamente como referencia para la continuidad del plan.</w:t>
-      </w:r>
-    </w:p>
-    <w:p>
-      <w:pPr>
-        <w:pStyle w:val="Heading1"/>
-      </w:pPr>
-      <w:r>
-        <w:t>4. METODOLOGÍA DE SEGUIMIENTO</w:t>
-      </w:r>
-    </w:p>
-    <w:p>
-      <w:pPr>
-        <w:jc w:val="both"/>
-      </w:pPr>
-      <w:r>
-        <w:rPr>
-          <w:i w:val="0"/>
-        </w:rPr>
-        <w:t>Para la elaboración del informe se aplicó una metodología de verificación documental y análisis de cumplimiento, compuesta por las siguientes etapas:</w:t>
-      </w:r>
-    </w:p>
-    <w:p>
-      <w:pPr>
-        <w:pStyle w:val="ListBullet"/>
-        <w:spacing w:after="80"/>
-        <w:jc w:val="both"/>
-      </w:pPr>
-      <w:r>
-        <w:t>Revisión del cronograma anual del PETI 2026 y de los hitos programados para el primer semestre.</w:t>
-      </w:r>
-    </w:p>
-    <w:p>
-      <w:pPr>
-        <w:pStyle w:val="ListBullet"/>
-        <w:spacing w:after="80"/>
-        <w:jc w:val="both"/>
-      </w:pPr>
-      <w:r>
-        <w:t>Validación del estado registrado para cada hito: ejecutado, pendiente o reprogramado.</w:t>
-      </w:r>
-    </w:p>
-    <w:p>
-      <w:pPr>
-        <w:pStyle w:val="ListBullet"/>
-        <w:spacing w:after="80"/>
-        <w:jc w:val="both"/>
-      </w:pPr>
-      <w:r>
-        <w:t>Revisión de las evidencias disponibles, entre ellas el PETI actualizado, la Política de Seguridad de la Información elaborada, las actas de seguimiento contractual de marzo y junio y las gestiones adelantadas ante MinTIC para la capacitación en seguridad digital.</w:t>
-      </w:r>
-    </w:p>
-    <w:p>
-      <w:pPr>
-        <w:pStyle w:val="ListBullet"/>
-        <w:spacing w:after="80"/>
-        <w:jc w:val="both"/>
-      </w:pPr>
-      <w:r>
-        <w:t>Cálculo de indicadores de cumplimiento semestral y avance anual.</w:t>
-      </w:r>
-    </w:p>
-    <w:p>
-      <w:pPr>
-        <w:pStyle w:val="ListBullet"/>
-        <w:spacing w:after="80"/>
-        <w:jc w:val="both"/>
-      </w:pPr>
-      <w:r>
-        <w:t>Identificación de alertas, dependencias externas y acciones de mejora para el segundo semestre.</w:t>
-      </w:r>
-    </w:p>
-    <w:p>
-      <w:pPr>
-        <w:jc w:val="both"/>
-      </w:pPr>
-      <w:r>
-        <w:rPr>
-          <w:b/>
-        </w:rPr>
-        <w:t>Fórmula aplicada:</w:t>
-      </w:r>
-      <w:r>
-        <w:t xml:space="preserve"> Cumplimiento semestral = (hitos ejecutados / hitos programados en el semestre) × 100. Resultado: (5 / 6) × 100 = 83,33%.</w:t>
-      </w:r>
-    </w:p>
-    <w:p>
-      <w:pPr>
-        <w:pStyle w:val="Heading1"/>
-      </w:pPr>
-      <w:r>
-        <w:t>5. ARTICULACIÓN CON LAS DIMENSIONES DE MIPG</w:t>
-      </w:r>
-    </w:p>
-    <w:p>
-      <w:pPr>
-        <w:jc w:val="both"/>
-      </w:pPr>
-      <w:r>
-        <w:rPr>
-          <w:i w:val="0"/>
-        </w:rPr>
-        <w:t>De forma similar al enfoque utilizado en los informes institucionales de Control Interno, el seguimiento al PETI se relaciona con las siguientes dimensiones del Modelo Integrado de Planeación y Gestión:</w:t>
-      </w:r>
-    </w:p>
-    <w:p>
-      <w:pPr>
-        <w:jc w:val="both"/>
-      </w:pPr>
-      <w:r>
-        <w:rPr>
-          <w:b/>
-        </w:rPr>
-        <w:t>Dimensión de Direccionamiento Estratégico y Planeación:</w:t>
-      </w:r>
-      <w:r>
-        <w:t xml:space="preserve"> la actualización del PETI 2026 consolida la hoja de ruta tecnológica de la entidad y orienta la priorización de acciones de seguridad, continuidad, servicios tecnológicos y fortalecimiento institucional.</w:t>
-      </w:r>
-    </w:p>
-    <w:p>
-      <w:pPr>
-        <w:jc w:val="both"/>
-      </w:pPr>
-      <w:r>
-        <w:rPr>
-          <w:b/>
-        </w:rPr>
-        <w:t>Dimensión de Gestión con Valores para Resultados:</w:t>
-      </w:r>
-      <w:r>
-        <w:t xml:space="preserve"> el seguimiento al proveedor externo de hardware y software contribuye a asegurar la disponibilidad de los recursos tecnológicos requeridos para la operación y la atención de los grupos de valor.</w:t>
-      </w:r>
-    </w:p>
-    <w:p>
-      <w:pPr>
-        <w:jc w:val="both"/>
-      </w:pPr>
-      <w:r>
-        <w:rPr>
-          <w:b/>
-        </w:rPr>
-        <w:t>Dimensión de Información y Comunicación:</w:t>
-      </w:r>
-      <w:r>
-        <w:t xml:space="preserve"> la elaboración de la Política de Seguridad de la Información y la gestión de capacitación en seguridad digital fortalecen la protección, disponibilidad y uso adecuado de la información institucional.</w:t>
-      </w:r>
-    </w:p>
-    <w:p>
-      <w:pPr>
-        <w:jc w:val="both"/>
-      </w:pPr>
-      <w:r>
-        <w:rPr>
-          <w:b/>
-        </w:rPr>
-        <w:t>Dimensión de Evaluación de Resultados:</w:t>
-      </w:r>
-      <w:r>
-        <w:t xml:space="preserve"> el presente informe mide el avance del PETI, compara lo programado frente a lo ejecutado e identifica acciones correctivas y de continuidad.</w:t>
-      </w:r>
-    </w:p>
-    <w:p>
-      <w:pPr>
-        <w:jc w:val="both"/>
-      </w:pPr>
-      <w:r>
-        <w:rPr>
-          <w:b/>
-        </w:rPr>
-        <w:t>Dimensión de Control Interno:</w:t>
-      </w:r>
-      <w:r>
-        <w:t xml:space="preserve"> la documentación de evidencias, alertas y recomendaciones facilita el monitoreo preventivo, la trazabilidad y la toma de decisiones por parte de la Dirección Administrativa y Financiera, la Gerencia General y Control Interno.</w:t>
+        <w:t>El informe comprende las actividades e hitos del PETI programados entre el 1 de enero y el 30 de junio de 2026. El presente documento hace parte de los hitos ejecutados al cierre del semestre. Las actividades previstas para el segundo semestre se presentan únicamente como referencia para la continuidad del plan.</w:t>
       </w:r>
     </w:p>
     <w:p>
@@ -660,7 +435,7 @@
         <w:pStyle w:val="Heading1"/>
       </w:pPr>
       <w:r>
-        <w:t>6. RESULTADOS DEL SEGUIMIENTO</w:t>
+        <w:t>4. RESULTADOS DEL SEGUIMIENTO</w:t>
       </w:r>
     </w:p>
     <w:p>
@@ -668,7 +443,7 @@
         <w:pStyle w:val="Heading2"/>
       </w:pPr>
       <w:r>
-        <w:t>6.1 Resumen ejecutivo de cumplimiento</w:t>
+        <w:t>4.1 Resumen de cumplimiento</w:t>
       </w:r>
     </w:p>
     <w:tbl>
@@ -1188,7 +963,7 @@
         <w:rPr>
           <w:i w:val="0"/>
         </w:rPr>
-        <w:t>El resultado del 83,33% evidencia un nivel de ejecución favorable. El único hito no ejecutado corresponde a la capacitación en seguridad digital, cuya programación depende de la confirmación de fecha por parte de MinTIC. No se registran actividades reprogramadas al corte.</w:t>
+        <w:t>El resultado del 83,33% refleja un avance favorable de las actividades previstas para el semestre. El único hito pendiente corresponde a la capacitación en seguridad digital, cuya programación depende de la confirmación de fecha por parte de MinTIC. No se registran actividades reprogramadas al corte.</w:t>
       </w:r>
     </w:p>
     <w:p>
@@ -1196,7 +971,7 @@
         <w:pStyle w:val="Heading2"/>
       </w:pPr>
       <w:r>
-        <w:t>6.2 Comportamiento mensual</w:t>
+        <w:t>4.2 Comparación histórica 2025–2026</w:t>
       </w:r>
     </w:p>
     <w:p>
@@ -1206,7 +981,7 @@
       <w:r>
         <w:drawing>
           <wp:inline xmlns:a="http://schemas.openxmlformats.org/drawingml/2006/main" xmlns:pic="http://schemas.openxmlformats.org/drawingml/2006/picture">
-            <wp:extent cx="6217920" cy="3218046"/>
+            <wp:extent cx="6217920" cy="3243540"/>
             <wp:docPr id="2" name="Picture 2"/>
             <wp:cNvGraphicFramePr>
               <a:graphicFrameLocks noChangeAspect="1"/>
@@ -1215,7 +990,7 @@
               <a:graphicData uri="http://schemas.openxmlformats.org/drawingml/2006/picture">
                 <pic:pic>
                   <pic:nvPicPr>
-                    <pic:cNvPr id="0" name="02_programado_ejecutado_mes.png"/>
+                    <pic:cNvPr id="0" name="02_comparacion_2025_2026.png"/>
                     <pic:cNvPicPr/>
                   </pic:nvPicPr>
                   <pic:blipFill>
@@ -1227,7 +1002,7 @@
                   <pic:spPr>
                     <a:xfrm>
                       <a:off x="0" y="0"/>
-                      <a:ext cx="6217920" cy="3218046"/>
+                      <a:ext cx="6217920" cy="3243540"/>
                     </a:xfrm>
                     <a:prstGeom prst="rect"/>
                   </pic:spPr>
@@ -1249,7 +1024,7 @@
           <w:color w:val="595959"/>
           <w:sz w:val="16"/>
         </w:rPr>
-        <w:t>Gráfica 2. Comparación mensual de hitos programados y ejecutados durante el primer semestre.</w:t>
+        <w:t>Gráfica 2. Implementación del plan de trabajo y del seguimiento semestral al PETI en 2026, frente a su inexistencia en 2025.</w:t>
       </w:r>
     </w:p>
     <w:p>
@@ -1260,7 +1035,7 @@
         <w:rPr>
           <w:i w:val="0"/>
         </w:rPr>
-        <w:t>Durante febrero y marzo se alcanzó el 100% de los hitos programados para cada mes. En junio se programaron cuatro (4) hitos y se ejecutaron tres (3), equivalentes al 75% mensual. La diferencia corresponde a la capacitación en seguridad digital pendiente de confirmación por MinTIC.</w:t>
+        <w:t>En 2025 la entidad no contaba con un plan de trabajo del PETI. Tampoco se realizaba seguimiento al PETI. A partir de 2026 se implementan por primera vez ambos instrumentos. Este cambio se presenta como un avance institucional y una nueva práctica de gestión que permite ordenar las actividades tecnológicas y conservar evidencia de su desarrollo; no corresponde a una calificación de incumplimiento del año anterior.</w:t>
       </w:r>
     </w:p>
     <w:p>
@@ -1268,7 +1043,7 @@
         <w:pStyle w:val="Heading2"/>
       </w:pPr>
       <w:r>
-        <w:t>6.3 Avance acumulado anual</w:t>
+        <w:t>4.3 Avance acumulado anual</w:t>
       </w:r>
     </w:p>
     <w:p>
@@ -1340,7 +1115,7 @@
         <w:pStyle w:val="Heading2"/>
       </w:pPr>
       <w:r>
-        <w:t>6.4 Cumplimiento por componente</w:t>
+        <w:t>4.4 Cumplimiento por componente</w:t>
       </w:r>
     </w:p>
     <w:p>
@@ -1404,7 +1179,7 @@
         <w:rPr>
           <w:i w:val="0"/>
         </w:rPr>
-        <w:t>Los componentes de planeación, seguimiento contractual y monitoreo del PETI presentan cumplimiento. La Política de Seguridad de la Información fue elaborada técnicamente y se encuentra pendiente de aprobación mediante acto administrativo; por tanto, aunque se reconoce como producto elaborado en la medición operativa, su cierre administrativo deberá verificarse en el segundo semestre. La capacitación en seguridad digital continúa pendiente por dependencia externa.</w:t>
+        <w:t>Los componentes de planeación, seguimiento contractual y seguimiento del PETI presentan cumplimiento. La Política de Seguridad de la Información fue elaborada técnicamente y se encuentra pendiente de aprobación mediante acto administrativo; en consecuencia, el producto se reconoce como elaborado, pero su adopción formal deberá completarse en el segundo semestre. La capacitación en seguridad digital continúa pendiente por dependencia externa.</w:t>
       </w:r>
     </w:p>
     <w:p>
@@ -1424,7 +1199,7 @@
         <w:pStyle w:val="Heading1"/>
       </w:pPr>
       <w:r>
-        <w:t>7. SEGUIMIENTO DETALLADO DE LOS HITOS DEL PRIMER SEMESTRE</w:t>
+        <w:t>5. SEGUIMIENTO DETALLADO DE LOS HITOS DEL PRIMER SEMESTRE</w:t>
       </w:r>
     </w:p>
     <w:tbl>
@@ -2505,7 +2280,7 @@
                 <w:b w:val="0"/>
                 <w:sz w:val="14"/>
               </w:rPr>
-              <w:t>Hito ejecutado con la elaboración y remisión del informe a Control Interno.</w:t>
+              <w:t>Hito ejecutado con la elaboración del presente documento.</w:t>
             </w:r>
           </w:p>
         </w:tc>
@@ -2526,7 +2301,7 @@
         <w:pStyle w:val="Heading1"/>
       </w:pPr>
       <w:r>
-        <w:t>8. ANÁLISIS DE RESULTADOS</w:t>
+        <w:t>6. ANÁLISIS DE RESULTADOS</w:t>
       </w:r>
     </w:p>
     <w:p>
@@ -2570,7 +2345,7 @@
         <w:rPr>
           <w:i w:val="0"/>
         </w:rPr>
-        <w:t>Respecto de la Política de Seguridad de la Información, el documento técnico está elaborado; no obstante, el indicador definido en el PETI contempla su aprobación y adopción mediante acto administrativo. En consecuencia, el producto se registra como elaborado para efectos del avance operativo, pero deberá cerrarse formalmente con la expedición del acto administrativo y la divulgación a los destinatarios de la política.</w:t>
+        <w:t>Respecto de la Política de Seguridad de la Información, el documento técnico está elaborado; no obstante, el indicador definido en el PETI contempla su aprobación y adopción mediante acto administrativo. En consecuencia, el producto se registra como elaborado para efectos del avance operativo, pero deberá cerrarse formalmente con la expedición del acto administrativo y la divulgación a las personas a quienes aplica la política.</w:t>
       </w:r>
     </w:p>
     <w:p>
@@ -2578,7 +2353,7 @@
         <w:pStyle w:val="Heading1"/>
       </w:pPr>
       <w:r>
-        <w:t>9. ALERTAS Y ASPECTOS POR FORTALECER</w:t>
+        <w:t>7. ALERTAS Y ASPECTOS POR FORTALECER</w:t>
       </w:r>
     </w:p>
     <w:p>
@@ -2636,7 +2411,7 @@
         <w:pStyle w:val="Heading1"/>
       </w:pPr>
       <w:r>
-        <w:t>10. RECOMENDACIONES PARA EL SEGUNDO SEMESTRE</w:t>
+        <w:t>8. RECOMENDACIONES PARA EL SEGUNDO SEMESTRE</w:t>
       </w:r>
     </w:p>
     <w:p>
@@ -2728,7 +2503,7 @@
         <w:pStyle w:val="Heading1"/>
       </w:pPr>
       <w:r>
-        <w:t>11. MATRIZ DE EVIDENCIAS</w:t>
+        <w:t>9. MATRIZ DE EVIDENCIAS</w:t>
       </w:r>
     </w:p>
     <w:tbl>
@@ -3364,7 +3139,7 @@
         <w:pStyle w:val="Heading1"/>
       </w:pPr>
       <w:r>
-        <w:t>12. CONCLUSIÓN</w:t>
+        <w:t>10. CONCLUSIÓN</w:t>
       </w:r>
     </w:p>
     <w:p>
@@ -3397,7 +3172,7 @@
         <w:rPr>
           <w:i w:val="0"/>
         </w:rPr>
-        <w:t>El presente informe se remite a Control Interno para su conocimiento, evaluación y recomendaciones, y se constituye en evidencia del cumplimiento de la actividad de seguimiento semestral prevista en el PETI 2026.</w:t>
+        <w:t>La implementación en 2026 del plan de trabajo y del seguimiento semestral, inexistentes en 2025, constituye una mejora institucional que fortalece la organización, la trazabilidad y la continuidad de la gestión tecnológica. El presente informe deja evidencia de esta nueva práctica y del cumplimiento de la actividad de seguimiento prevista en el PETI 2026.</w:t>
       </w:r>
     </w:p>
     <w:p>
@@ -3405,7 +3180,7 @@
         <w:pStyle w:val="Heading1"/>
       </w:pPr>
       <w:r>
-        <w:t>13. RESPONSABLE DEL INFORME</w:t>
+        <w:t>11. RESPONSABLE DEL INFORME</w:t>
       </w:r>
     </w:p>
     <w:p/>

</xml_diff>